<commit_message>
Apply official Vyntra VP logo across onboarding pack (Version 1.0)
- Add the official Vyntra "VP" lockup as the brand mark. Key out the navy
  background (build/process-logo.mjs) into transparent lockup, navy-flattened
  lockup, and a standalone gold VP monogram.
- Cover now features the full logo lockup; every interior page header uses the
  real gold VP monogram in the navy badge.
- DOCX cover and running header use the logo.
- Preserve source artwork at src/assets/logo-source.webp for reproducibility.

Co-Authored-By: Claude Opus 4.8 <noreply@anthropic.com>
Claude-Session: https://claude.ai/code/session_014U2YUKzxVsPNM9UfUwPNwA
</commit_message>
<xml_diff>
--- a/onboarding-pack/dist/Vyntra-Subcontractor-Onboarding-Pack.docx
+++ b/onboarding-pack/dist/Vyntra-Subcontractor-Onboarding-Pack.docx
@@ -35,17 +35,42 @@
           </w:tcPr>
           <w:p>
             <w:pPr>
-              <w:spacing w:after="200"/>
+              <w:spacing w:after="280"/>
+              <w:jc w:val="left"/>
             </w:pPr>
             <w:r>
-              <w:rPr>
-                <w:rFonts w:ascii="Calibri" w:hAnsi="Calibri"/>
-                <w:b/>
-                <w:i w:val="0"/>
-                <w:color w:val="D4AF37"/>
-                <w:sz w:val="20"/>
-              </w:rPr>
-              <w:t>VYNTRA PROPERTY SERVICES</w:t>
+              <w:drawing>
+                <wp:inline xmlns:a="http://schemas.openxmlformats.org/drawingml/2006/main" xmlns:pic="http://schemas.openxmlformats.org/drawingml/2006/picture">
+                  <wp:extent cx="3240000" cy="675811"/>
+                  <wp:docPr id="1" name="Picture 1"/>
+                  <wp:cNvGraphicFramePr>
+                    <a:graphicFrameLocks noChangeAspect="1"/>
+                  </wp:cNvGraphicFramePr>
+                  <a:graphic>
+                    <a:graphicData uri="http://schemas.openxmlformats.org/drawingml/2006/picture">
+                      <pic:pic>
+                        <pic:nvPicPr>
+                          <pic:cNvPr id="0" name="logo-on-navy.png"/>
+                          <pic:cNvPicPr/>
+                        </pic:nvPicPr>
+                        <pic:blipFill>
+                          <a:blip r:embed="rId10"/>
+                          <a:stretch>
+                            <a:fillRect/>
+                          </a:stretch>
+                        </pic:blipFill>
+                        <pic:spPr>
+                          <a:xfrm>
+                            <a:off x="0" y="0"/>
+                            <a:ext cx="3240000" cy="675811"/>
+                          </a:xfrm>
+                          <a:prstGeom prst="rect"/>
+                        </pic:spPr>
+                      </pic:pic>
+                    </a:graphicData>
+                  </a:graphic>
+                </wp:inline>
+              </w:drawing>
             </w:r>
           </w:p>
           <w:p>
@@ -7436,13 +7461,67 @@
       </w:pPr>
     </w:p>
     <w:sectPr>
+      <w:headerReference w:type="default" r:id="rId9"/>
       <w:pgSz w:w="11906" w:h="16838"/>
-      <w:pgMar w:top="1134" w:right="1134" w:bottom="1020" w:left="1134" w:header="720" w:footer="720" w:gutter="0"/>
+      <w:pgMar w:top="1134" w:right="1134" w:bottom="1020" w:left="1134" w:header="624" w:footer="720" w:gutter="0"/>
       <w:cols w:space="720"/>
+      <w:titlePg/>
       <w:docGrid w:linePitch="360"/>
     </w:sectPr>
   </w:body>
 </w:document>
+</file>
+
+<file path=word/header1.xml><?xml version="1.0" encoding="utf-8"?>
+<w:hdr xmlns:m="http://schemas.openxmlformats.org/officeDocument/2006/math" xmlns:mc="http://schemas.openxmlformats.org/markup-compatibility/2006" xmlns:mo="http://schemas.microsoft.com/office/mac/office/2008/main" xmlns:mv="urn:schemas-microsoft-com:mac:vml" xmlns:o="urn:schemas-microsoft-com:office:office" xmlns:r="http://schemas.openxmlformats.org/officeDocument/2006/relationships" xmlns:v="urn:schemas-microsoft-com:vml" xmlns:w10="urn:schemas-microsoft-com:office:word" xmlns:w14="http://schemas.microsoft.com/office/word/2010/wordml" xmlns:w="http://schemas.openxmlformats.org/wordprocessingml/2006/main" xmlns:wne="http://schemas.microsoft.com/office/word/2006/wordml" xmlns:wp14="http://schemas.microsoft.com/office/word/2010/wordprocessingDrawing" xmlns:wp="http://schemas.openxmlformats.org/drawingml/2006/wordprocessingDrawing" xmlns:wpc="http://schemas.microsoft.com/office/word/2010/wordprocessingCanvas" xmlns:wpg="http://schemas.microsoft.com/office/word/2010/wordprocessingGroup" xmlns:wpi="http://schemas.microsoft.com/office/word/2010/wordprocessingInk" xmlns:wps="http://schemas.microsoft.com/office/word/2010/wordprocessingShape" mc:Ignorable="w14 wp14">
+  <w:p>
+    <w:pPr>
+      <w:pStyle w:val="Header"/>
+    </w:pPr>
+    <w:r>
+      <w:drawing>
+        <wp:inline xmlns:a="http://schemas.openxmlformats.org/drawingml/2006/main" xmlns:pic="http://schemas.openxmlformats.org/drawingml/2006/picture">
+          <wp:extent cx="949259" cy="198000"/>
+          <wp:docPr id="1" name="Picture 1"/>
+          <wp:cNvGraphicFramePr>
+            <a:graphicFrameLocks noChangeAspect="1"/>
+          </wp:cNvGraphicFramePr>
+          <a:graphic>
+            <a:graphicData uri="http://schemas.openxmlformats.org/drawingml/2006/picture">
+              <pic:pic>
+                <pic:nvPicPr>
+                  <pic:cNvPr id="0" name="logo-on-navy.png"/>
+                  <pic:cNvPicPr/>
+                </pic:nvPicPr>
+                <pic:blipFill>
+                  <a:blip r:embed="rId1"/>
+                  <a:stretch>
+                    <a:fillRect/>
+                  </a:stretch>
+                </pic:blipFill>
+                <pic:spPr>
+                  <a:xfrm>
+                    <a:off x="0" y="0"/>
+                    <a:ext cx="949259" cy="198000"/>
+                  </a:xfrm>
+                  <a:prstGeom prst="rect"/>
+                </pic:spPr>
+              </pic:pic>
+            </a:graphicData>
+          </a:graphic>
+        </wp:inline>
+      </w:drawing>
+    </w:r>
+    <w:r>
+      <w:rPr>
+        <w:rFonts w:ascii="Calibri" w:hAnsi="Calibri"/>
+        <w:color w:val="64748B"/>
+        <w:sz w:val="16"/>
+      </w:rPr>
+      <w:t xml:space="preserve">   Subcontractor Onboarding Pack</w:t>
+    </w:r>
+  </w:p>
+</w:hdr>
 </file>
 
 <file path=word/numbering.xml><?xml version="1.0" encoding="utf-8"?>

</xml_diff>

<commit_message>
Use VP|VYNTRA PROPERTY SERVICES lockup on every page; drop tagline
- Remove the "Professional • Reliable • Results" tagline from the logo.
- Add light-background logo variant (wordmark recoloured navy) and place the
  full lockup at the top of every interior page, replacing the VYNTRA. badge.
- Cover and DOCX use the tagline-free lockup; remove the now-unused VP mark asset.

Co-Authored-By: Claude Opus 4.8 <noreply@anthropic.com>
Claude-Session: https://claude.ai/code/session_014U2YUKzxVsPNM9UfUwPNwA
</commit_message>
<xml_diff>
--- a/onboarding-pack/dist/Vyntra-Subcontractor-Onboarding-Pack.docx
+++ b/onboarding-pack/dist/Vyntra-Subcontractor-Onboarding-Pack.docx
@@ -7481,7 +7481,7 @@
     <w:r>
       <w:drawing>
         <wp:inline xmlns:a="http://schemas.openxmlformats.org/drawingml/2006/main" xmlns:pic="http://schemas.openxmlformats.org/drawingml/2006/picture">
-          <wp:extent cx="949259" cy="198000"/>
+          <wp:extent cx="1035556" cy="216000"/>
           <wp:docPr id="1" name="Picture 1"/>
           <wp:cNvGraphicFramePr>
             <a:graphicFrameLocks noChangeAspect="1"/>
@@ -7490,7 +7490,7 @@
             <a:graphicData uri="http://schemas.openxmlformats.org/drawingml/2006/picture">
               <pic:pic>
                 <pic:nvPicPr>
-                  <pic:cNvPr id="0" name="logo-on-navy.png"/>
+                  <pic:cNvPr id="0" name="logo-light.png"/>
                   <pic:cNvPicPr/>
                 </pic:nvPicPr>
                 <pic:blipFill>
@@ -7502,7 +7502,7 @@
                 <pic:spPr>
                   <a:xfrm>
                     <a:off x="0" y="0"/>
-                    <a:ext cx="949259" cy="198000"/>
+                    <a:ext cx="1035556" cy="216000"/>
                   </a:xfrm>
                   <a:prstGeom prst="rect"/>
                 </pic:spPr>

</xml_diff>

<commit_message>
Swap to transparent logo source; improve print legibility
- Replace logo source with the clean transparent VP|VYNTRA PROPERTY SERVICES
  artwork. Cover keeps the white wordmark on navy; page headers use the
  navy-wordmark variant (recoloured for light backgrounds).
- Print-legibility pass: darken body and muted text colours and increase the
  smallest type sizes (body, tables, checklists, callouts, clauses, FAQ,
  footer) for clearer printed output. Verified no content overflow on any page.

Co-Authored-By: Claude Opus 4.8 <noreply@anthropic.com>
Claude-Session: https://claude.ai/code/session_014U2YUKzxVsPNM9UfUwPNwA
</commit_message>
<xml_diff>
--- a/onboarding-pack/dist/Vyntra-Subcontractor-Onboarding-Pack.docx
+++ b/onboarding-pack/dist/Vyntra-Subcontractor-Onboarding-Pack.docx
@@ -41,7 +41,7 @@
             <w:r>
               <w:drawing>
                 <wp:inline xmlns:a="http://schemas.openxmlformats.org/drawingml/2006/main" xmlns:pic="http://schemas.openxmlformats.org/drawingml/2006/picture">
-                  <wp:extent cx="3240000" cy="675811"/>
+                  <wp:extent cx="3240000" cy="695510"/>
                   <wp:docPr id="1" name="Picture 1"/>
                   <wp:cNvGraphicFramePr>
                     <a:graphicFrameLocks noChangeAspect="1"/>
@@ -62,7 +62,7 @@
                         <pic:spPr>
                           <a:xfrm>
                             <a:off x="0" y="0"/>
-                            <a:ext cx="3240000" cy="675811"/>
+                            <a:ext cx="3240000" cy="695510"/>
                           </a:xfrm>
                           <a:prstGeom prst="rect"/>
                         </pic:spPr>
@@ -159,7 +159,7 @@
                 <w:rFonts w:ascii="Calibri" w:hAnsi="Calibri"/>
                 <w:b/>
                 <w:i w:val="0"/>
-                <w:color w:val="64748B"/>
+                <w:color w:val="475569"/>
                 <w:sz w:val="16"/>
               </w:rPr>
               <w:t>VERSION</w:t>
@@ -198,7 +198,7 @@
                 <w:rFonts w:ascii="Calibri" w:hAnsi="Calibri"/>
                 <w:b/>
                 <w:i w:val="0"/>
-                <w:color w:val="64748B"/>
+                <w:color w:val="475569"/>
                 <w:sz w:val="16"/>
               </w:rPr>
               <w:t>EFFECTIVE DATE</w:t>
@@ -237,7 +237,7 @@
                 <w:rFonts w:ascii="Calibri" w:hAnsi="Calibri"/>
                 <w:b/>
                 <w:i w:val="0"/>
-                <w:color w:val="64748B"/>
+                <w:color w:val="475569"/>
                 <w:sz w:val="16"/>
               </w:rPr>
               <w:t>REVIEW CYCLE</w:t>
@@ -265,7 +265,7 @@
           <w:rFonts w:ascii="Calibri" w:hAnsi="Calibri"/>
           <w:b w:val="0"/>
           <w:i w:val="0"/>
-          <w:color w:val="64748B"/>
+          <w:color w:val="475569"/>
           <w:sz w:val="17"/>
         </w:rPr>
         <w:t>Vyntra Property Services   ·   ABN 69 252 402 831   ·   Sydney, New South Wales   ·   CONFIDENTIAL</w:t>
@@ -360,7 +360,7 @@
           <w:rFonts w:ascii="Calibri" w:hAnsi="Calibri"/>
           <w:b w:val="0"/>
           <w:i w:val="0"/>
-          <w:color w:val="334155"/>
+          <w:color w:val="2B3849"/>
           <w:sz w:val="21"/>
         </w:rPr>
         <w:t>Vyntra Property Services is a Sydney-based provider of premium property maintenance and cleaning. We connect property owners and managers with skilled subcontractors who get the job done properly, the first time.</w:t>
@@ -466,7 +466,7 @@
           <w:rFonts w:ascii="Calibri" w:hAnsi="Calibri"/>
           <w:b w:val="0"/>
           <w:i w:val="0"/>
-          <w:color w:val="334155"/>
+          <w:color w:val="2B3849"/>
           <w:sz w:val="20"/>
         </w:rPr>
         <w:t>Quality — workmanship you would be proud to put your own name to.</w:t>
@@ -492,7 +492,7 @@
           <w:rFonts w:ascii="Calibri" w:hAnsi="Calibri"/>
           <w:b w:val="0"/>
           <w:i w:val="0"/>
-          <w:color w:val="334155"/>
+          <w:color w:val="2B3849"/>
           <w:sz w:val="20"/>
         </w:rPr>
         <w:t>Reliability — turn up on time, communicate, and finish what you start.</w:t>
@@ -518,7 +518,7 @@
           <w:rFonts w:ascii="Calibri" w:hAnsi="Calibri"/>
           <w:b w:val="0"/>
           <w:i w:val="0"/>
-          <w:color w:val="334155"/>
+          <w:color w:val="2B3849"/>
           <w:sz w:val="20"/>
         </w:rPr>
         <w:t>Respect — treat every client, property and colleague with courtesy.</w:t>
@@ -548,7 +548,7 @@
           <w:rFonts w:ascii="Calibri" w:hAnsi="Calibri"/>
           <w:b w:val="0"/>
           <w:i w:val="0"/>
-          <w:color w:val="334155"/>
+          <w:color w:val="2B3849"/>
           <w:sz w:val="21"/>
         </w:rPr>
         <w:t>As an independent subcontractor, you are the face of Vyntra on every job. The quality of your work and the way you treat our clients directly shapes our reputation — and your future opportunities with us.</w:t>
@@ -605,7 +605,7 @@
                 <w:rFonts w:ascii="Calibri" w:hAnsi="Calibri"/>
                 <w:b w:val="0"/>
                 <w:i w:val="0"/>
-                <w:color w:val="334155"/>
+                <w:color w:val="2B3849"/>
                 <w:sz w:val="19"/>
               </w:rPr>
               <w:t>In return, we commit to clear job briefs, responsive support, fair rates and reliable payment — so you can focus on doing great work.</w:t>
@@ -713,7 +713,7 @@
           <w:rFonts w:ascii="Calibri" w:hAnsi="Calibri"/>
           <w:b w:val="0"/>
           <w:i w:val="0"/>
-          <w:color w:val="64748B"/>
+          <w:color w:val="475569"/>
           <w:sz w:val="19"/>
         </w:rPr>
         <w:t>A property owner or manager books a job through Vyntra.</w:t>
@@ -748,7 +748,7 @@
           <w:rFonts w:ascii="Calibri" w:hAnsi="Calibri"/>
           <w:b w:val="0"/>
           <w:i w:val="0"/>
-          <w:color w:val="64748B"/>
+          <w:color w:val="475569"/>
           <w:sz w:val="19"/>
         </w:rPr>
         <w:t>We confirm scope, timing and the agreed rate.</w:t>
@@ -783,7 +783,7 @@
           <w:rFonts w:ascii="Calibri" w:hAnsi="Calibri"/>
           <w:b w:val="0"/>
           <w:i w:val="0"/>
-          <w:color w:val="64748B"/>
+          <w:color w:val="475569"/>
           <w:sz w:val="19"/>
         </w:rPr>
         <w:t>You get the full brief, address and access details.</w:t>
@@ -818,7 +818,7 @@
           <w:rFonts w:ascii="Calibri" w:hAnsi="Calibri"/>
           <w:b w:val="0"/>
           <w:i w:val="0"/>
-          <w:color w:val="64748B"/>
+          <w:color w:val="475569"/>
           <w:sz w:val="19"/>
         </w:rPr>
         <w:t>Confirm promptly so we can plan with confidence.</w:t>
@@ -853,7 +853,7 @@
           <w:rFonts w:ascii="Calibri" w:hAnsi="Calibri"/>
           <w:b w:val="0"/>
           <w:i w:val="0"/>
-          <w:color w:val="64748B"/>
+          <w:color w:val="475569"/>
           <w:sz w:val="19"/>
         </w:rPr>
         <w:t>Deliver to Vyntra’s quality and safety standards.</w:t>
@@ -888,7 +888,7 @@
           <w:rFonts w:ascii="Calibri" w:hAnsi="Calibri"/>
           <w:b w:val="0"/>
           <w:i w:val="0"/>
-          <w:color w:val="64748B"/>
+          <w:color w:val="475569"/>
           <w:sz w:val="19"/>
         </w:rPr>
         <w:t>Required evidence for every job, no exceptions.</w:t>
@@ -923,7 +923,7 @@
           <w:rFonts w:ascii="Calibri" w:hAnsi="Calibri"/>
           <w:b w:val="0"/>
           <w:i w:val="0"/>
-          <w:color w:val="64748B"/>
+          <w:color w:val="475569"/>
           <w:sz w:val="19"/>
         </w:rPr>
         <w:t>The client signs off that the work meets expectations.</w:t>
@@ -958,7 +958,7 @@
           <w:rFonts w:ascii="Calibri" w:hAnsi="Calibri"/>
           <w:b w:val="0"/>
           <w:i w:val="0"/>
-          <w:color w:val="64748B"/>
+          <w:color w:val="475569"/>
           <w:sz w:val="19"/>
         </w:rPr>
         <w:t>Send your tax invoice quoting the Vyntra job number.</w:t>
@@ -993,7 +993,7 @@
           <w:rFonts w:ascii="Calibri" w:hAnsi="Calibri"/>
           <w:b w:val="0"/>
           <w:i w:val="0"/>
-          <w:color w:val="64748B"/>
+          <w:color w:val="475569"/>
           <w:sz w:val="19"/>
         </w:rPr>
         <w:t>Paid to your nominated account on our payment terms.</w:t>
@@ -1050,7 +1050,7 @@
                 <w:rFonts w:ascii="Calibri" w:hAnsi="Calibri"/>
                 <w:b w:val="0"/>
                 <w:i w:val="0"/>
-                <w:color w:val="334155"/>
+                <w:color w:val="2B3849"/>
                 <w:sz w:val="19"/>
               </w:rPr>
               <w:t>Fast acceptance, clean photos and a correct invoice are the three things that get you paid sooner.</w:t>
@@ -1149,7 +1149,7 @@
           <w:rFonts w:ascii="Calibri" w:hAnsi="Calibri"/>
           <w:b w:val="0"/>
           <w:i w:val="0"/>
-          <w:color w:val="334155"/>
+          <w:color w:val="2B3849"/>
           <w:sz w:val="20"/>
         </w:rPr>
         <w:t>Wear clean, professional workwear and enclosed safety footwear.</w:t>
@@ -1175,7 +1175,7 @@
           <w:rFonts w:ascii="Calibri" w:hAnsi="Calibri"/>
           <w:b w:val="0"/>
           <w:i w:val="0"/>
-          <w:color w:val="334155"/>
+          <w:color w:val="2B3849"/>
           <w:sz w:val="20"/>
         </w:rPr>
         <w:t>Maintain good personal hygiene and a tidy, professional appearance.</w:t>
@@ -1201,7 +1201,7 @@
           <w:rFonts w:ascii="Calibri" w:hAnsi="Calibri"/>
           <w:b w:val="0"/>
           <w:i w:val="0"/>
-          <w:color w:val="334155"/>
+          <w:color w:val="2B3849"/>
           <w:sz w:val="20"/>
         </w:rPr>
         <w:t>Keep your tools, equipment and vehicle clean and well presented.</w:t>
@@ -1227,7 +1227,7 @@
           <w:rFonts w:ascii="Calibri" w:hAnsi="Calibri"/>
           <w:b w:val="0"/>
           <w:i w:val="0"/>
-          <w:color w:val="334155"/>
+          <w:color w:val="2B3849"/>
           <w:sz w:val="20"/>
         </w:rPr>
         <w:t>No Vyntra uniform is required — your own business branding is welcome.</w:t>
@@ -1268,7 +1268,7 @@
           <w:rFonts w:ascii="Calibri" w:hAnsi="Calibri"/>
           <w:b w:val="0"/>
           <w:i w:val="0"/>
-          <w:color w:val="334155"/>
+          <w:color w:val="2B3849"/>
           <w:sz w:val="20"/>
         </w:rPr>
         <w:t>Introduce yourself as working on behalf of Vyntra Property Services.</w:t>
@@ -1294,7 +1294,7 @@
           <w:rFonts w:ascii="Calibri" w:hAnsi="Calibri"/>
           <w:b w:val="0"/>
           <w:i w:val="0"/>
-          <w:color w:val="334155"/>
+          <w:color w:val="2B3849"/>
           <w:sz w:val="20"/>
         </w:rPr>
         <w:t>Greet clients politely and explain what you will be doing.</w:t>
@@ -1320,7 +1320,7 @@
           <w:rFonts w:ascii="Calibri" w:hAnsi="Calibri"/>
           <w:b w:val="0"/>
           <w:i w:val="0"/>
-          <w:color w:val="334155"/>
+          <w:color w:val="2B3849"/>
           <w:sz w:val="20"/>
         </w:rPr>
         <w:t>Listen, be patient, and never argue with a client.</w:t>
@@ -1346,7 +1346,7 @@
           <w:rFonts w:ascii="Calibri" w:hAnsi="Calibri"/>
           <w:b w:val="0"/>
           <w:i w:val="0"/>
-          <w:color w:val="334155"/>
+          <w:color w:val="2B3849"/>
           <w:sz w:val="20"/>
         </w:rPr>
         <w:t>Leave the client feeling looked after, not just serviced.</w:t>
@@ -1387,7 +1387,7 @@
           <w:rFonts w:ascii="Calibri" w:hAnsi="Calibri"/>
           <w:b w:val="0"/>
           <w:i w:val="0"/>
-          <w:color w:val="334155"/>
+          <w:color w:val="2B3849"/>
           <w:sz w:val="20"/>
         </w:rPr>
         <w:t>Respond to Vyntra messages and calls promptly.</w:t>
@@ -1413,7 +1413,7 @@
           <w:rFonts w:ascii="Calibri" w:hAnsi="Calibri"/>
           <w:b w:val="0"/>
           <w:i w:val="0"/>
-          <w:color w:val="334155"/>
+          <w:color w:val="2B3849"/>
           <w:sz w:val="20"/>
         </w:rPr>
         <w:t>Flag delays, access issues or extra work straight away.</w:t>
@@ -1439,7 +1439,7 @@
           <w:rFonts w:ascii="Calibri" w:hAnsi="Calibri"/>
           <w:b w:val="0"/>
           <w:i w:val="0"/>
-          <w:color w:val="334155"/>
+          <w:color w:val="2B3849"/>
           <w:sz w:val="20"/>
         </w:rPr>
         <w:t>Keep all job communication professional and on record.</w:t>
@@ -1465,7 +1465,7 @@
           <w:rFonts w:ascii="Calibri" w:hAnsi="Calibri"/>
           <w:b w:val="0"/>
           <w:i w:val="0"/>
-          <w:color w:val="334155"/>
+          <w:color w:val="2B3849"/>
           <w:sz w:val="20"/>
         </w:rPr>
         <w:t>Never share your personal rates or details with clients.</w:t>
@@ -1506,7 +1506,7 @@
           <w:rFonts w:ascii="Calibri" w:hAnsi="Calibri"/>
           <w:b w:val="0"/>
           <w:i w:val="0"/>
-          <w:color w:val="334155"/>
+          <w:color w:val="2B3849"/>
           <w:sz w:val="20"/>
         </w:rPr>
         <w:t>Arrive within the agreed appointment window.</w:t>
@@ -1532,7 +1532,7 @@
           <w:rFonts w:ascii="Calibri" w:hAnsi="Calibri"/>
           <w:b w:val="0"/>
           <w:i w:val="0"/>
-          <w:color w:val="334155"/>
+          <w:color w:val="2B3849"/>
           <w:sz w:val="20"/>
         </w:rPr>
         <w:t>Call ahead immediately if you are going to be late.</w:t>
@@ -1558,7 +1558,7 @@
           <w:rFonts w:ascii="Calibri" w:hAnsi="Calibri"/>
           <w:b w:val="0"/>
           <w:i w:val="0"/>
-          <w:color w:val="334155"/>
+          <w:color w:val="2B3849"/>
           <w:sz w:val="20"/>
         </w:rPr>
         <w:t>Allow enough time to complete the job properly.</w:t>
@@ -1584,7 +1584,7 @@
           <w:rFonts w:ascii="Calibri" w:hAnsi="Calibri"/>
           <w:b w:val="0"/>
           <w:i w:val="0"/>
-          <w:color w:val="334155"/>
+          <w:color w:val="2B3849"/>
           <w:sz w:val="20"/>
         </w:rPr>
         <w:t>Respect the client’s time as much as your own.</w:t>
@@ -1641,7 +1641,7 @@
                 <w:rFonts w:ascii="Calibri" w:hAnsi="Calibri"/>
                 <w:b w:val="0"/>
                 <w:i w:val="0"/>
-                <w:color w:val="334155"/>
+                <w:color w:val="2B3849"/>
                 <w:sz w:val="19"/>
               </w:rPr>
               <w:t>Problems and surprises happen on every job. Contact Vyntra immediately — you will never be in trouble for reporting a genuine issue early. Trying to hide a mistake is the only real mistake.</w:t>
@@ -1740,7 +1740,7 @@
           <w:rFonts w:ascii="Calibri" w:hAnsi="Calibri"/>
           <w:b w:val="0"/>
           <w:i w:val="0"/>
-          <w:color w:val="334155"/>
+          <w:color w:val="2B3849"/>
           <w:sz w:val="20"/>
         </w:rPr>
         <w:t>Use drop sheets and protect surfaces and floors.</w:t>
@@ -1766,7 +1766,7 @@
           <w:rFonts w:ascii="Calibri" w:hAnsi="Calibri"/>
           <w:b w:val="0"/>
           <w:i w:val="0"/>
-          <w:color w:val="334155"/>
+          <w:color w:val="2B3849"/>
           <w:sz w:val="20"/>
         </w:rPr>
         <w:t>Clean as you go and remove all rubbish and offcuts.</w:t>
@@ -1792,7 +1792,7 @@
           <w:rFonts w:ascii="Calibri" w:hAnsi="Calibri"/>
           <w:b w:val="0"/>
           <w:i w:val="0"/>
-          <w:color w:val="334155"/>
+          <w:color w:val="2B3849"/>
           <w:sz w:val="20"/>
         </w:rPr>
         <w:t>Leave the area cleaner than you found it.</w:t>
@@ -1833,7 +1833,7 @@
           <w:rFonts w:ascii="Calibri" w:hAnsi="Calibri"/>
           <w:b w:val="0"/>
           <w:i w:val="0"/>
-          <w:color w:val="334155"/>
+          <w:color w:val="2B3849"/>
           <w:sz w:val="20"/>
         </w:rPr>
         <w:t>Take clear before photos prior to starting.</w:t>
@@ -1859,7 +1859,7 @@
           <w:rFonts w:ascii="Calibri" w:hAnsi="Calibri"/>
           <w:b w:val="0"/>
           <w:i w:val="0"/>
-          <w:color w:val="334155"/>
+          <w:color w:val="2B3849"/>
           <w:sz w:val="20"/>
         </w:rPr>
         <w:t>Take matching after photos from the same angles.</w:t>
@@ -1885,7 +1885,7 @@
           <w:rFonts w:ascii="Calibri" w:hAnsi="Calibri"/>
           <w:b w:val="0"/>
           <w:i w:val="0"/>
-          <w:color w:val="334155"/>
+          <w:color w:val="2B3849"/>
           <w:sz w:val="20"/>
         </w:rPr>
         <w:t>Upload to the job before you leave site — every time.</w:t>
@@ -1926,7 +1926,7 @@
           <w:rFonts w:ascii="Calibri" w:hAnsi="Calibri"/>
           <w:b w:val="0"/>
           <w:i w:val="0"/>
-          <w:color w:val="334155"/>
+          <w:color w:val="2B3849"/>
           <w:sz w:val="20"/>
         </w:rPr>
         <w:t>Only access the areas required for the job.</w:t>
@@ -1952,7 +1952,7 @@
           <w:rFonts w:ascii="Calibri" w:hAnsi="Calibri"/>
           <w:b w:val="0"/>
           <w:i w:val="0"/>
-          <w:color w:val="334155"/>
+          <w:color w:val="2B3849"/>
           <w:sz w:val="20"/>
         </w:rPr>
         <w:t>Handle the client’s belongings with care.</w:t>
@@ -1978,7 +1978,7 @@
           <w:rFonts w:ascii="Calibri" w:hAnsi="Calibri"/>
           <w:b w:val="0"/>
           <w:i w:val="0"/>
-          <w:color w:val="334155"/>
+          <w:color w:val="2B3849"/>
           <w:sz w:val="20"/>
         </w:rPr>
         <w:t>Secure doors, windows and gates when you leave.</w:t>
@@ -2004,7 +2004,7 @@
           <w:rFonts w:ascii="Calibri" w:hAnsi="Calibri"/>
           <w:b w:val="0"/>
           <w:i w:val="0"/>
-          <w:color w:val="334155"/>
+          <w:color w:val="2B3849"/>
           <w:sz w:val="20"/>
         </w:rPr>
         <w:t>Report any pre-existing damage before you start.</w:t>
@@ -2045,7 +2045,7 @@
           <w:rFonts w:ascii="Calibri" w:hAnsi="Calibri"/>
           <w:b w:val="0"/>
           <w:i w:val="0"/>
-          <w:color w:val="334155"/>
+          <w:color w:val="2B3849"/>
           <w:sz w:val="20"/>
         </w:rPr>
         <w:t>Keep client details and access codes confidential.</w:t>
@@ -2071,7 +2071,7 @@
           <w:rFonts w:ascii="Calibri" w:hAnsi="Calibri"/>
           <w:b w:val="0"/>
           <w:i w:val="0"/>
-          <w:color w:val="334155"/>
+          <w:color w:val="2B3849"/>
           <w:sz w:val="20"/>
         </w:rPr>
         <w:t>Do not photograph clients or belongings beyond the work.</w:t>
@@ -2097,7 +2097,7 @@
           <w:rFonts w:ascii="Calibri" w:hAnsi="Calibri"/>
           <w:b w:val="0"/>
           <w:i w:val="0"/>
-          <w:color w:val="334155"/>
+          <w:color w:val="2B3849"/>
           <w:sz w:val="20"/>
         </w:rPr>
         <w:t>Never discuss one client’s job with another.</w:t>
@@ -2154,7 +2154,7 @@
                 <w:rFonts w:ascii="Calibri" w:hAnsi="Calibri"/>
                 <w:b w:val="0"/>
                 <w:i w:val="0"/>
-                <w:color w:val="334155"/>
+                <w:color w:val="2B3849"/>
                 <w:sz w:val="19"/>
               </w:rPr>
               <w:t>No smoking or vaping on or around any client property. Never attend a job under the influence of alcohol or drugs, and never consume them on site. Breaches result in immediate removal from the job and may end your engagement.</w:t>
@@ -2253,7 +2253,7 @@
           <w:rFonts w:ascii="Calibri" w:hAnsi="Calibri"/>
           <w:b w:val="0"/>
           <w:i w:val="0"/>
-          <w:color w:val="334155"/>
+          <w:color w:val="2B3849"/>
           <w:sz w:val="20"/>
         </w:rPr>
         <w:t>Do not post client properties, addresses or people.</w:t>
@@ -2279,7 +2279,7 @@
           <w:rFonts w:ascii="Calibri" w:hAnsi="Calibri"/>
           <w:b w:val="0"/>
           <w:i w:val="0"/>
-          <w:color w:val="334155"/>
+          <w:color w:val="2B3849"/>
           <w:sz w:val="20"/>
         </w:rPr>
         <w:t>Get written approval before using Vyntra’s name or logo.</w:t>
@@ -2305,7 +2305,7 @@
           <w:rFonts w:ascii="Calibri" w:hAnsi="Calibri"/>
           <w:b w:val="0"/>
           <w:i w:val="0"/>
-          <w:color w:val="334155"/>
+          <w:color w:val="2B3849"/>
           <w:sz w:val="20"/>
         </w:rPr>
         <w:t>Never post anything that could embarrass a client or Vyntra.</w:t>
@@ -2346,7 +2346,7 @@
           <w:rFonts w:ascii="Calibri" w:hAnsi="Calibri"/>
           <w:b w:val="0"/>
           <w:i w:val="0"/>
-          <w:color w:val="334155"/>
+          <w:color w:val="2B3849"/>
           <w:sz w:val="20"/>
         </w:rPr>
         <w:t>Act honestly and ethically at all times.</w:t>
@@ -2372,7 +2372,7 @@
           <w:rFonts w:ascii="Calibri" w:hAnsi="Calibri"/>
           <w:b w:val="0"/>
           <w:i w:val="0"/>
-          <w:color w:val="334155"/>
+          <w:color w:val="2B3849"/>
           <w:sz w:val="20"/>
         </w:rPr>
         <w:t>Refer all quotes and bookings back to Vyntra.</w:t>
@@ -2398,7 +2398,7 @@
           <w:rFonts w:ascii="Calibri" w:hAnsi="Calibri"/>
           <w:b w:val="0"/>
           <w:i w:val="0"/>
-          <w:color w:val="334155"/>
+          <w:color w:val="2B3849"/>
           <w:sz w:val="20"/>
         </w:rPr>
         <w:t>Raise any client concern with Vyntra immediately.</w:t>
@@ -2439,7 +2439,7 @@
           <w:rFonts w:ascii="Calibri" w:hAnsi="Calibri"/>
           <w:b w:val="0"/>
           <w:i w:val="0"/>
-          <w:color w:val="334155"/>
+          <w:color w:val="2B3849"/>
           <w:sz w:val="20"/>
         </w:rPr>
         <w:t>Soliciting clients for private or cash-in-hand work.</w:t>
@@ -2465,7 +2465,7 @@
           <w:rFonts w:ascii="Calibri" w:hAnsi="Calibri"/>
           <w:b w:val="0"/>
           <w:i w:val="0"/>
-          <w:color w:val="334155"/>
+          <w:color w:val="2B3849"/>
           <w:sz w:val="20"/>
         </w:rPr>
         <w:t>Dishonesty, theft or misuse of client property.</w:t>
@@ -2491,7 +2491,7 @@
           <w:rFonts w:ascii="Calibri" w:hAnsi="Calibri"/>
           <w:b w:val="0"/>
           <w:i w:val="0"/>
-          <w:color w:val="334155"/>
+          <w:color w:val="2B3849"/>
           <w:sz w:val="20"/>
         </w:rPr>
         <w:t>Aggressive, threatening or discriminatory conduct.</w:t>
@@ -2517,7 +2517,7 @@
           <w:rFonts w:ascii="Calibri" w:hAnsi="Calibri"/>
           <w:b w:val="0"/>
           <w:i w:val="0"/>
-          <w:color w:val="334155"/>
+          <w:color w:val="2B3849"/>
           <w:sz w:val="20"/>
         </w:rPr>
         <w:t>Sharing client data or images without consent.</w:t>
@@ -2543,7 +2543,7 @@
           <w:rFonts w:ascii="Calibri" w:hAnsi="Calibri"/>
           <w:b w:val="0"/>
           <w:i w:val="0"/>
-          <w:color w:val="334155"/>
+          <w:color w:val="2B3849"/>
           <w:sz w:val="20"/>
         </w:rPr>
         <w:t>Working while impaired by alcohol or drugs.</w:t>
@@ -2569,7 +2569,7 @@
           <w:rFonts w:ascii="Calibri" w:hAnsi="Calibri"/>
           <w:b w:val="0"/>
           <w:i w:val="0"/>
-          <w:color w:val="334155"/>
+          <w:color w:val="2B3849"/>
           <w:sz w:val="20"/>
         </w:rPr>
         <w:t>Subcontracting a Vyntra job without our approval.</w:t>
@@ -2595,7 +2595,7 @@
           <w:rFonts w:ascii="Calibri" w:hAnsi="Calibri"/>
           <w:b w:val="0"/>
           <w:i w:val="0"/>
-          <w:color w:val="334155"/>
+          <w:color w:val="2B3849"/>
           <w:sz w:val="20"/>
         </w:rPr>
         <w:t>Unsafe work practices or ignoring site safety.</w:t>
@@ -2621,7 +2621,7 @@
           <w:rFonts w:ascii="Calibri" w:hAnsi="Calibri"/>
           <w:b w:val="0"/>
           <w:i w:val="0"/>
-          <w:color w:val="334155"/>
+          <w:color w:val="2B3849"/>
           <w:sz w:val="20"/>
         </w:rPr>
         <w:t>Falsifying photos, invoices or job records.</w:t>
@@ -2678,7 +2678,7 @@
                 <w:rFonts w:ascii="Calibri" w:hAnsi="Calibri"/>
                 <w:b w:val="0"/>
                 <w:i w:val="0"/>
-                <w:color w:val="334155"/>
+                <w:color w:val="2B3849"/>
                 <w:sz w:val="19"/>
               </w:rPr>
               <w:t>Serious or repeated breaches of this Code may lead to suspension or immediate termination of your engagement, and where appropriate, referral to the relevant authorities.</w:t>
@@ -2880,7 +2880,7 @@
                 <w:rFonts w:ascii="Calibri" w:hAnsi="Calibri"/>
                 <w:b w:val="0"/>
                 <w:i w:val="0"/>
-                <w:color w:val="334155"/>
+                <w:color w:val="2B3849"/>
                 <w:sz w:val="19"/>
               </w:rPr>
               <w:t>14 days from receipt of a valid tax invoice</w:t>
@@ -2930,7 +2930,7 @@
                 <w:rFonts w:ascii="Calibri" w:hAnsi="Calibri"/>
                 <w:b w:val="0"/>
                 <w:i w:val="0"/>
-                <w:color w:val="334155"/>
+                <w:color w:val="2B3849"/>
                 <w:sz w:val="19"/>
               </w:rPr>
               <w:t>Electronic funds transfer (EFT) to your nominated account</w:t>
@@ -2978,7 +2978,7 @@
                 <w:rFonts w:ascii="Calibri" w:hAnsi="Calibri"/>
                 <w:b w:val="0"/>
                 <w:i w:val="0"/>
-                <w:color w:val="334155"/>
+                <w:color w:val="2B3849"/>
                 <w:sz w:val="19"/>
               </w:rPr>
               <w:t>Processed weekly; cleared funds typically within 1–2 business days</w:t>
@@ -3028,7 +3028,7 @@
                 <w:rFonts w:ascii="Calibri" w:hAnsi="Calibri"/>
                 <w:b w:val="0"/>
                 <w:i w:val="0"/>
-                <w:color w:val="334155"/>
+                <w:color w:val="2B3849"/>
                 <w:sz w:val="19"/>
               </w:rPr>
               <w:t>Emailed to you each time a payment is made</w:t>
@@ -3165,7 +3165,7 @@
                 <w:rFonts w:ascii="Calibri" w:hAnsi="Calibri"/>
                 <w:b w:val="0"/>
                 <w:i w:val="0"/>
-                <w:color w:val="334155"/>
+                <w:color w:val="2B3849"/>
                 <w:sz w:val="19"/>
               </w:rPr>
               <w:t>Quoted on every invoice so we can match it quickly</w:t>
@@ -3215,7 +3215,7 @@
                 <w:rFonts w:ascii="Calibri" w:hAnsi="Calibri"/>
                 <w:b w:val="0"/>
                 <w:i w:val="0"/>
-                <w:color w:val="334155"/>
+                <w:color w:val="2B3849"/>
                 <w:sz w:val="19"/>
               </w:rPr>
               <w:t>Must match the details we hold on file</w:t>
@@ -3263,7 +3263,7 @@
                 <w:rFonts w:ascii="Calibri" w:hAnsi="Calibri"/>
                 <w:b w:val="0"/>
                 <w:i w:val="0"/>
-                <w:color w:val="334155"/>
+                <w:color w:val="2B3849"/>
                 <w:sz w:val="19"/>
               </w:rPr>
               <w:t>If registered, show GST separately and the words "Tax Invoice"</w:t>
@@ -3313,7 +3313,7 @@
                 <w:rFonts w:ascii="Calibri" w:hAnsi="Calibri"/>
                 <w:b w:val="0"/>
                 <w:i w:val="0"/>
-                <w:color w:val="334155"/>
+                <w:color w:val="2B3849"/>
                 <w:sz w:val="19"/>
               </w:rPr>
               <w:t>Clear line items, site address and date completed</w:t>
@@ -3361,7 +3361,7 @@
                 <w:rFonts w:ascii="Calibri" w:hAnsi="Calibri"/>
                 <w:b w:val="0"/>
                 <w:i w:val="0"/>
-                <w:color w:val="334155"/>
+                <w:color w:val="2B3849"/>
                 <w:sz w:val="19"/>
               </w:rPr>
               <w:t>BSB and account number for EFT payment</w:t>
@@ -3426,7 +3426,7 @@
                 <w:rFonts w:ascii="Calibri" w:hAnsi="Calibri"/>
                 <w:b w:val="0"/>
                 <w:i w:val="0"/>
-                <w:color w:val="334155"/>
+                <w:color w:val="2B3849"/>
                 <w:sz w:val="19"/>
               </w:rPr>
               <w:t>Quote a valid ABN on every invoice. If you are registered for GST, add 10% GST and label it clearly. No ABN may mean we must withhold tax at the top rate.</w:t>
@@ -3613,7 +3613,7 @@
                 <w:rFonts w:ascii="Calibri" w:hAnsi="Calibri"/>
                 <w:b w:val="0"/>
                 <w:i w:val="0"/>
-                <w:color w:val="334155"/>
+                <w:color w:val="2B3849"/>
                 <w:sz w:val="19"/>
               </w:rPr>
               <w:t>A minimum charge applies to every attendance, as agreed for the job</w:t>
@@ -3663,7 +3663,7 @@
                 <w:rFonts w:ascii="Calibri" w:hAnsi="Calibri"/>
                 <w:b w:val="0"/>
                 <w:i w:val="0"/>
-                <w:color w:val="334155"/>
+                <w:color w:val="2B3849"/>
                 <w:sz w:val="19"/>
               </w:rPr>
               <w:t>Mon–Fri, 7:00am–5:00pm at the agreed standard rate</w:t>
@@ -3711,7 +3711,7 @@
                 <w:rFonts w:ascii="Calibri" w:hAnsi="Calibri"/>
                 <w:b w:val="0"/>
                 <w:i w:val="0"/>
-                <w:color w:val="334155"/>
+                <w:color w:val="2B3849"/>
                 <w:sz w:val="19"/>
               </w:rPr>
               <w:t>Evenings &amp; weekends attract a higher agreed rate — confirm before attending</w:t>
@@ -3761,7 +3761,7 @@
                 <w:rFonts w:ascii="Calibri" w:hAnsi="Calibri"/>
                 <w:b w:val="0"/>
                 <w:i w:val="0"/>
-                <w:color w:val="334155"/>
+                <w:color w:val="2B3849"/>
                 <w:sz w:val="19"/>
               </w:rPr>
               <w:t>Urgent call-outs are paid at the agreed emergency rate and prioritised</w:t>
@@ -3898,7 +3898,7 @@
                 <w:rFonts w:ascii="Calibri" w:hAnsi="Calibri"/>
                 <w:b w:val="0"/>
                 <w:i w:val="0"/>
-                <w:color w:val="334155"/>
+                <w:color w:val="2B3849"/>
                 <w:sz w:val="19"/>
               </w:rPr>
               <w:t>Stop and get written approval from Vyntra before any work beyond the original scope. Unapproved extras may not be paid.</w:t>
@@ -3948,7 +3948,7 @@
                 <w:rFonts w:ascii="Calibri" w:hAnsi="Calibri"/>
                 <w:b w:val="0"/>
                 <w:i w:val="0"/>
-                <w:color w:val="334155"/>
+                <w:color w:val="2B3849"/>
                 <w:sz w:val="19"/>
               </w:rPr>
               <w:t>If a client cancels with less than 24 hours’ notice after you are dispatched, a cancellation fee may apply as agreed.</w:t>
@@ -3996,7 +3996,7 @@
                 <w:rFonts w:ascii="Calibri" w:hAnsi="Calibri"/>
                 <w:b w:val="0"/>
                 <w:i w:val="0"/>
-                <w:color w:val="334155"/>
+                <w:color w:val="2B3849"/>
                 <w:sz w:val="19"/>
               </w:rPr>
               <w:t>Any change to price, scope or timing must be confirmed by Vyntra in writing.</w:t>
@@ -4061,7 +4061,7 @@
                 <w:rFonts w:ascii="Calibri" w:hAnsi="Calibri"/>
                 <w:b w:val="0"/>
                 <w:i w:val="0"/>
-                <w:color w:val="334155"/>
+                <w:color w:val="2B3849"/>
                 <w:sz w:val="19"/>
               </w:rPr>
               <w:t>You are engaged and paid by Vyntra, not the client. Provided you have completed the work to standard and invoiced correctly, you are paid on our standard terms regardless of whether the client has paid us. Never chase payment directly from a client.</w:t>
@@ -4296,7 +4296,7 @@
                 <w:rFonts w:ascii="Calibri" w:hAnsi="Calibri"/>
                 <w:b w:val="0"/>
                 <w:i w:val="0"/>
-                <w:color w:val="334155"/>
+                <w:color w:val="2B3849"/>
                 <w:sz w:val="19"/>
               </w:rPr>
               <w:t>Mandatory</w:t>
@@ -4370,7 +4370,7 @@
                 <w:rFonts w:ascii="Calibri" w:hAnsi="Calibri"/>
                 <w:b w:val="0"/>
                 <w:i w:val="0"/>
-                <w:color w:val="334155"/>
+                <w:color w:val="2B3849"/>
                 <w:sz w:val="19"/>
               </w:rPr>
               <w:t>Mandatory</w:t>
@@ -4441,7 +4441,7 @@
                 <w:rFonts w:ascii="Calibri" w:hAnsi="Calibri"/>
                 <w:b w:val="0"/>
                 <w:i w:val="0"/>
-                <w:color w:val="334155"/>
+                <w:color w:val="2B3849"/>
                 <w:sz w:val="19"/>
               </w:rPr>
               <w:t>Mandatory</w:t>
@@ -4515,7 +4515,7 @@
                 <w:rFonts w:ascii="Calibri" w:hAnsi="Calibri"/>
                 <w:b w:val="0"/>
                 <w:i w:val="0"/>
-                <w:color w:val="334155"/>
+                <w:color w:val="2B3849"/>
                 <w:sz w:val="19"/>
               </w:rPr>
               <w:t>If applicable</w:t>
@@ -4586,7 +4586,7 @@
                 <w:rFonts w:ascii="Calibri" w:hAnsi="Calibri"/>
                 <w:b w:val="0"/>
                 <w:i w:val="0"/>
-                <w:color w:val="334155"/>
+                <w:color w:val="2B3849"/>
                 <w:sz w:val="19"/>
               </w:rPr>
               <w:t>If required</w:t>
@@ -4660,7 +4660,7 @@
                 <w:rFonts w:ascii="Calibri" w:hAnsi="Calibri"/>
                 <w:b w:val="0"/>
                 <w:i w:val="0"/>
-                <w:color w:val="334155"/>
+                <w:color w:val="2B3849"/>
                 <w:sz w:val="19"/>
               </w:rPr>
               <w:t>If required</w:t>
@@ -4731,7 +4731,7 @@
                 <w:rFonts w:ascii="Calibri" w:hAnsi="Calibri"/>
                 <w:b w:val="0"/>
                 <w:i w:val="0"/>
-                <w:color w:val="334155"/>
+                <w:color w:val="2B3849"/>
                 <w:sz w:val="19"/>
               </w:rPr>
               <w:t>Mandatory</w:t>
@@ -4805,7 +4805,7 @@
                 <w:rFonts w:ascii="Calibri" w:hAnsi="Calibri"/>
                 <w:b w:val="0"/>
                 <w:i w:val="0"/>
-                <w:color w:val="334155"/>
+                <w:color w:val="2B3849"/>
                 <w:sz w:val="19"/>
               </w:rPr>
               <w:t>Mandatory</w:t>
@@ -4866,7 +4866,7 @@
                 <w:rFonts w:ascii="Calibri" w:hAnsi="Calibri"/>
                 <w:b w:val="0"/>
                 <w:i w:val="0"/>
-                <w:color w:val="334155"/>
+                <w:color w:val="2B3849"/>
                 <w:sz w:val="19"/>
               </w:rPr>
               <w:t>Attach clear PDF or photo copies to info@vyntrapropertyservices.com or upload them through your subcontractor portal. Keep insurance and checks current — expired documents will pause your jobs until renewed.</w:t>
@@ -5053,7 +5053,7 @@
                 <w:rFonts w:ascii="Calibri" w:hAnsi="Calibri"/>
                 <w:b w:val="0"/>
                 <w:i w:val="0"/>
-                <w:color w:val="334155"/>
+                <w:color w:val="2B3849"/>
                 <w:sz w:val="19"/>
               </w:rPr>
               <w:t>Vyntra Property Services</w:t>
@@ -5103,7 +5103,7 @@
                 <w:rFonts w:ascii="Calibri" w:hAnsi="Calibri"/>
                 <w:b w:val="0"/>
                 <w:i w:val="0"/>
-                <w:color w:val="334155"/>
+                <w:color w:val="2B3849"/>
                 <w:sz w:val="19"/>
               </w:rPr>
               <w:t>69 252 402 831</w:t>
@@ -5151,7 +5151,7 @@
                 <w:rFonts w:ascii="Calibri" w:hAnsi="Calibri"/>
                 <w:b w:val="0"/>
                 <w:i w:val="0"/>
-                <w:color w:val="334155"/>
+                <w:color w:val="2B3849"/>
                 <w:sz w:val="19"/>
               </w:rPr>
               <w:t>As named on the signed declaration</w:t>
@@ -5201,7 +5201,7 @@
                 <w:rFonts w:ascii="Calibri" w:hAnsi="Calibri"/>
                 <w:b w:val="0"/>
                 <w:i w:val="0"/>
-                <w:color w:val="334155"/>
+                <w:color w:val="2B3849"/>
                 <w:sz w:val="19"/>
               </w:rPr>
               <w:t>New South Wales, Australia</w:t>
@@ -5249,7 +5249,7 @@
           <w:rFonts w:ascii="Calibri" w:hAnsi="Calibri"/>
           <w:b w:val="0"/>
           <w:i w:val="0"/>
-          <w:color w:val="334155"/>
+          <w:color w:val="2B3849"/>
           <w:sz w:val="19"/>
         </w:rPr>
         <w:t>You are engaged as an independent contractor, not an employee, partner or agent of Vyntra. You are responsible for your own tax, superannuation, insurances and leave. Nothing in this Agreement creates an employment relationship, and you may work for others provided you meet your obligations to us.</w:t>
@@ -5289,7 +5289,7 @@
           <w:rFonts w:ascii="Calibri" w:hAnsi="Calibri"/>
           <w:b w:val="0"/>
           <w:i w:val="0"/>
-          <w:color w:val="334155"/>
+          <w:color w:val="2B3849"/>
           <w:sz w:val="19"/>
         </w:rPr>
         <w:t>Vyntra will offer you property maintenance and cleaning jobs from time to time. Each job will specify the work, location, timing and rate. You agree to perform accepted work with due care, skill and to the standards set out in this pack and any reasonable directions from Vyntra.</w:t>
@@ -5329,7 +5329,7 @@
           <w:rFonts w:ascii="Calibri" w:hAnsi="Calibri"/>
           <w:b w:val="0"/>
           <w:i w:val="0"/>
-          <w:color w:val="334155"/>
+          <w:color w:val="2B3849"/>
           <w:sz w:val="19"/>
         </w:rPr>
         <w:t>You are free to accept or decline any job offered. Once you accept a job, you commit to completing it on time and to standard, or to giving Vyntra prompt notice if you genuinely cannot, so we can arrange an alternative.</w:t>
@@ -5369,7 +5369,7 @@
           <w:rFonts w:ascii="Calibri" w:hAnsi="Calibri"/>
           <w:b w:val="0"/>
           <w:i w:val="0"/>
-          <w:color w:val="334155"/>
+          <w:color w:val="2B3849"/>
           <w:sz w:val="19"/>
         </w:rPr>
         <w:t>Unless agreed otherwise, you supply your own tools, equipment, materials and transport, and are responsible for their condition, safety and maintenance.</w:t>
@@ -5409,7 +5409,7 @@
           <w:rFonts w:ascii="Calibri" w:hAnsi="Calibri"/>
           <w:b w:val="0"/>
           <w:i w:val="0"/>
-          <w:color w:val="334155"/>
+          <w:color w:val="2B3849"/>
           <w:sz w:val="19"/>
         </w:rPr>
         <w:t>You must hold and maintain current Public Liability Insurance of at least $20 million (or another minimum Vyntra notifies you of), plus any insurance required by law for your trade — for example Workers Compensation where applicable. You agree to provide certificates of currency on request and to keep them current at all times.</w:t>
@@ -5449,7 +5449,7 @@
           <w:rFonts w:ascii="Calibri" w:hAnsi="Calibri"/>
           <w:b w:val="0"/>
           <w:i w:val="0"/>
-          <w:color w:val="334155"/>
+          <w:color w:val="2B3849"/>
           <w:sz w:val="19"/>
         </w:rPr>
         <w:t>You agree to perform all work safely, lawfully and to a professional standard, complying with all work health and safety laws and the standards in this pack. You will take reasonable care for your own safety and that of others, and stop work and notify Vyntra if a situation is unsafe.</w:t>
@@ -5489,7 +5489,7 @@
           <w:rFonts w:ascii="Calibri" w:hAnsi="Calibri"/>
           <w:b w:val="0"/>
           <w:i w:val="0"/>
-          <w:color w:val="334155"/>
+          <w:color w:val="2B3849"/>
           <w:sz w:val="19"/>
         </w:rPr>
         <w:t>You will keep confidential all non-public information you learn through your engagement — including Vyntra’s clients, pricing, methods and systems — and use it only to perform the work. This obligation continues after your engagement ends.</w:t>
@@ -5529,7 +5529,7 @@
           <w:rFonts w:ascii="Calibri" w:hAnsi="Calibri"/>
           <w:b w:val="0"/>
           <w:i w:val="0"/>
-          <w:color w:val="334155"/>
+          <w:color w:val="2B3849"/>
           <w:sz w:val="19"/>
         </w:rPr>
         <w:t>You will handle any personal information of clients and occupants in line with the Privacy Act 1988 (Cth) and Vyntra’s directions — collecting only what is needed, keeping it secure, and never disclosing or using it for any purpose other than the job.</w:t>
@@ -5619,7 +5619,7 @@
           <w:rFonts w:ascii="Calibri" w:hAnsi="Calibri"/>
           <w:b w:val="0"/>
           <w:i w:val="0"/>
-          <w:color w:val="334155"/>
+          <w:color w:val="2B3849"/>
           <w:sz w:val="19"/>
         </w:rPr>
         <w:t>During your engagement and for 12 months after it ends, you will not directly or indirectly solicit, accept or perform private work for any Vyntra client you were introduced to or serviced through Vyntra, without Vyntra’s written consent. All client opportunities must be referred back to Vyntra.</w:t>
@@ -5659,7 +5659,7 @@
           <w:rFonts w:ascii="Calibri" w:hAnsi="Calibri"/>
           <w:b w:val="0"/>
           <w:i w:val="0"/>
-          <w:color w:val="334155"/>
+          <w:color w:val="2B3849"/>
           <w:sz w:val="19"/>
         </w:rPr>
         <w:t>Any materials, photos, reports or records you create in performing the work — including before and after photos — are Vyntra’s property and may be used by Vyntra for service delivery, quality and marketing. You grant Vyntra a perpetual licence to use them for these purposes.</w:t>
@@ -5699,7 +5699,7 @@
           <w:rFonts w:ascii="Calibri" w:hAnsi="Calibri"/>
           <w:b w:val="0"/>
           <w:i w:val="0"/>
-          <w:color w:val="334155"/>
+          <w:color w:val="2B3849"/>
           <w:sz w:val="19"/>
         </w:rPr>
         <w:t>You are responsible for the work you perform and for any loss, damage or claim arising from your acts, omissions or negligence. To the extent permitted by law, you indemnify Vyntra against such claims. Nothing in this clause limits rights that cannot be excluded under the Australian Consumer Law.</w:t>
@@ -5739,7 +5739,7 @@
           <w:rFonts w:ascii="Calibri" w:hAnsi="Calibri"/>
           <w:b w:val="0"/>
           <w:i w:val="0"/>
-          <w:color w:val="334155"/>
+          <w:color w:val="2B3849"/>
           <w:sz w:val="19"/>
         </w:rPr>
         <w:t>Either party may end this Agreement at any time by giving reasonable notice in writing. Vyntra may suspend or end your engagement immediately for a serious breach — including a breach of the Code of Conduct, safety, confidentiality or non-solicitation terms. Ending the Agreement does not affect rights or payments accrued beforehand.</w:t>
@@ -5779,7 +5779,7 @@
           <w:rFonts w:ascii="Calibri" w:hAnsi="Calibri"/>
           <w:b w:val="0"/>
           <w:i w:val="0"/>
-          <w:color w:val="334155"/>
+          <w:color w:val="2B3849"/>
           <w:sz w:val="19"/>
         </w:rPr>
         <w:t>You will not subcontract, assign or transfer a Vyntra job to anyone else without Vyntra’s prior written consent. Accepted jobs are personal to you and the team we have approved.</w:t>
@@ -5819,7 +5819,7 @@
           <w:rFonts w:ascii="Calibri" w:hAnsi="Calibri"/>
           <w:b w:val="0"/>
           <w:i w:val="0"/>
-          <w:color w:val="334155"/>
+          <w:color w:val="2B3849"/>
           <w:sz w:val="19"/>
         </w:rPr>
         <w:t>If a dispute arises, both parties agree to first raise it in good faith and try to resolve it through discussion. If it cannot be resolved within a reasonable time, the parties may refer the matter to mediation before commencing legal proceedings, except where urgent relief is needed.</w:t>
@@ -5859,7 +5859,7 @@
           <w:rFonts w:ascii="Calibri" w:hAnsi="Calibri"/>
           <w:b w:val="0"/>
           <w:i w:val="0"/>
-          <w:color w:val="334155"/>
+          <w:color w:val="2B3849"/>
           <w:sz w:val="19"/>
         </w:rPr>
         <w:t>This Agreement is governed by the laws of New South Wales, Australia. The parties submit to the non-exclusive jurisdiction of the courts of New South Wales.</w:t>
@@ -5899,7 +5899,7 @@
           <w:rFonts w:ascii="Calibri" w:hAnsi="Calibri"/>
           <w:b w:val="0"/>
           <w:i w:val="0"/>
-          <w:color w:val="334155"/>
+          <w:color w:val="2B3849"/>
           <w:sz w:val="19"/>
         </w:rPr>
         <w:t>This Agreement, together with the Code of Conduct, Payment Policy and each job’s brief, forms the entire agreement between us. If any part is found to be invalid, the rest continues to apply. Vyntra may update this pack from time to time and will notify you of material changes.</w:t>
@@ -5956,7 +5956,7 @@
                 <w:rFonts w:ascii="Calibri" w:hAnsi="Calibri"/>
                 <w:b w:val="0"/>
                 <w:i w:val="0"/>
-                <w:color w:val="334155"/>
+                <w:color w:val="2B3849"/>
                 <w:sz w:val="19"/>
               </w:rPr>
               <w:t>Be safe and insured, do great work, look after our clients and their information, refer client opportunities back to us, and we will keep the jobs and payments flowing. This document is a clear summary of our working arrangement and is not legal advice.</w:t>
@@ -6055,7 +6055,7 @@
           <w:rFonts w:ascii="Calibri" w:hAnsi="Calibri"/>
           <w:b w:val="0"/>
           <w:i w:val="0"/>
-          <w:color w:val="334155"/>
+          <w:color w:val="2B3849"/>
           <w:sz w:val="19"/>
         </w:rPr>
         <w:t>Within 14 days of us receiving a correct tax invoice. Payments go out by EFT in our weekly run.</w:t>
@@ -6096,7 +6096,7 @@
           <w:rFonts w:ascii="Calibri" w:hAnsi="Calibri"/>
           <w:b w:val="0"/>
           <w:i w:val="0"/>
-          <w:color w:val="334155"/>
+          <w:color w:val="2B3849"/>
           <w:sz w:val="19"/>
         </w:rPr>
         <w:t>Yes. You choose which jobs to accept. Please respond quickly so we can offer it to someone else if needed.</w:t>
@@ -6137,7 +6137,7 @@
           <w:rFonts w:ascii="Calibri" w:hAnsi="Calibri"/>
           <w:b w:val="0"/>
           <w:i w:val="0"/>
-          <w:color w:val="334155"/>
+          <w:color w:val="2B3849"/>
           <w:sz w:val="19"/>
         </w:rPr>
         <w:t>Call ahead as soon as you know. Keep the client and Vyntra informed — a quick heads-up prevents most problems.</w:t>
@@ -6178,7 +6178,7 @@
           <w:rFonts w:ascii="Calibri" w:hAnsi="Calibri"/>
           <w:b w:val="0"/>
           <w:i w:val="0"/>
-          <w:color w:val="334155"/>
+          <w:color w:val="2B3849"/>
           <w:sz w:val="19"/>
         </w:rPr>
         <w:t>Do not start it. Get written approval from Vyntra first so the extra scope and price are agreed and you get paid for it.</w:t>
@@ -6219,7 +6219,7 @@
           <w:rFonts w:ascii="Calibri" w:hAnsi="Calibri"/>
           <w:b w:val="0"/>
           <w:i w:val="0"/>
-          <w:color w:val="334155"/>
+          <w:color w:val="2B3849"/>
           <w:sz w:val="19"/>
         </w:rPr>
         <w:t>Your Vyntra coordinator on 0451 510 026 or info@vyntrapropertyservices.com for anything job-related.</w:t>
@@ -6260,7 +6260,7 @@
           <w:rFonts w:ascii="Calibri" w:hAnsi="Calibri"/>
           <w:b w:val="0"/>
           <w:i w:val="0"/>
-          <w:color w:val="334155"/>
+          <w:color w:val="2B3849"/>
           <w:sz w:val="19"/>
         </w:rPr>
         <w:t>Stop, make the area safe, and report it to Vyntra immediately with photos. Do not attempt to hide or quietly fix damage.</w:t>
@@ -6317,7 +6317,7 @@
                 <w:rFonts w:ascii="Calibri" w:hAnsi="Calibri"/>
                 <w:b w:val="0"/>
                 <w:i w:val="0"/>
-                <w:color w:val="334155"/>
+                <w:color w:val="2B3849"/>
                 <w:sz w:val="19"/>
               </w:rPr>
               <w:t>Reach the Vyntra team on 0451 510 026 or email info@vyntrapropertyservices.com. We are here to help you do your best work.</w:t>
@@ -6416,7 +6416,7 @@
           <w:rFonts w:ascii="Calibri" w:hAnsi="Calibri"/>
           <w:b w:val="0"/>
           <w:i w:val="0"/>
-          <w:color w:val="334155"/>
+          <w:color w:val="2B3849"/>
           <w:sz w:val="20"/>
         </w:rPr>
         <w:t>I agree to the Independent Contractor Agreement</w:t>
@@ -6442,7 +6442,7 @@
           <w:rFonts w:ascii="Calibri" w:hAnsi="Calibri"/>
           <w:b w:val="0"/>
           <w:i w:val="0"/>
-          <w:color w:val="334155"/>
+          <w:color w:val="2B3849"/>
           <w:sz w:val="20"/>
         </w:rPr>
         <w:t>I agree to the Code of Conduct</w:t>
@@ -6468,7 +6468,7 @@
           <w:rFonts w:ascii="Calibri" w:hAnsi="Calibri"/>
           <w:b w:val="0"/>
           <w:i w:val="0"/>
-          <w:color w:val="334155"/>
+          <w:color w:val="2B3849"/>
           <w:sz w:val="20"/>
         </w:rPr>
         <w:t>I agree to the Payment Policy</w:t>
@@ -6494,7 +6494,7 @@
           <w:rFonts w:ascii="Calibri" w:hAnsi="Calibri"/>
           <w:b w:val="0"/>
           <w:i w:val="0"/>
-          <w:color w:val="334155"/>
+          <w:color w:val="2B3849"/>
           <w:sz w:val="20"/>
         </w:rPr>
         <w:t>I agree to the Safety Requirements</w:t>
@@ -6520,7 +6520,7 @@
           <w:rFonts w:ascii="Calibri" w:hAnsi="Calibri"/>
           <w:b w:val="0"/>
           <w:i w:val="0"/>
-          <w:color w:val="334155"/>
+          <w:color w:val="2B3849"/>
           <w:sz w:val="20"/>
         </w:rPr>
         <w:t>I agree to maintain Confidentiality</w:t>
@@ -6546,7 +6546,7 @@
           <w:rFonts w:ascii="Calibri" w:hAnsi="Calibri"/>
           <w:b w:val="0"/>
           <w:i w:val="0"/>
-          <w:color w:val="334155"/>
+          <w:color w:val="2B3849"/>
           <w:sz w:val="20"/>
         </w:rPr>
         <w:t>I agree to protect Client Privacy</w:t>
@@ -6572,7 +6572,7 @@
           <w:rFonts w:ascii="Calibri" w:hAnsi="Calibri"/>
           <w:b w:val="0"/>
           <w:i w:val="0"/>
-          <w:color w:val="334155"/>
+          <w:color w:val="2B3849"/>
           <w:sz w:val="20"/>
         </w:rPr>
         <w:t>I agree to the Non-Solicitation Policy</w:t>
@@ -6598,7 +6598,7 @@
           <w:rFonts w:ascii="Calibri" w:hAnsi="Calibri"/>
           <w:b w:val="0"/>
           <w:i w:val="0"/>
-          <w:color w:val="334155"/>
+          <w:color w:val="2B3849"/>
           <w:sz w:val="19"/>
         </w:rPr>
         <w:t>I confirm that all information and documents I have provided are accurate and current, and I understand that providing false or expired documents may result in suspension or removal from the Vyntra network.</w:t>
@@ -6654,7 +6654,7 @@
                 <w:rFonts w:ascii="Calibri" w:hAnsi="Calibri"/>
                 <w:b/>
                 <w:i w:val="0"/>
-                <w:color w:val="64748B"/>
+                <w:color w:val="475569"/>
                 <w:sz w:val="16"/>
               </w:rPr>
               <w:t>FULL NAME</w:t>
@@ -6682,7 +6682,7 @@
                 <w:rFonts w:ascii="Calibri" w:hAnsi="Calibri"/>
                 <w:b/>
                 <w:i w:val="0"/>
-                <w:color w:val="64748B"/>
+                <w:color w:val="475569"/>
                 <w:sz w:val="16"/>
               </w:rPr>
               <w:t>ABN</w:t>
@@ -6712,7 +6712,7 @@
                 <w:rFonts w:ascii="Calibri" w:hAnsi="Calibri"/>
                 <w:b/>
                 <w:i w:val="0"/>
-                <w:color w:val="64748B"/>
+                <w:color w:val="475569"/>
                 <w:sz w:val="16"/>
               </w:rPr>
               <w:t>COMPANY NAME</w:t>
@@ -6740,7 +6740,7 @@
                 <w:rFonts w:ascii="Calibri" w:hAnsi="Calibri"/>
                 <w:b/>
                 <w:i w:val="0"/>
-                <w:color w:val="64748B"/>
+                <w:color w:val="475569"/>
                 <w:sz w:val="16"/>
               </w:rPr>
               <w:t>MOBILE NUMBER</w:t>
@@ -6770,7 +6770,7 @@
                 <w:rFonts w:ascii="Calibri" w:hAnsi="Calibri"/>
                 <w:b/>
                 <w:i w:val="0"/>
-                <w:color w:val="64748B"/>
+                <w:color w:val="475569"/>
                 <w:sz w:val="16"/>
               </w:rPr>
               <w:t>EMAIL</w:t>
@@ -6798,7 +6798,7 @@
                 <w:rFonts w:ascii="Calibri" w:hAnsi="Calibri"/>
                 <w:b/>
                 <w:i w:val="0"/>
-                <w:color w:val="64748B"/>
+                <w:color w:val="475569"/>
                 <w:sz w:val="16"/>
               </w:rPr>
               <w:t>DATE</w:t>
@@ -6848,7 +6848,7 @@
                 <w:rFonts w:ascii="Calibri" w:hAnsi="Calibri"/>
                 <w:b/>
                 <w:i w:val="0"/>
-                <w:color w:val="64748B"/>
+                <w:color w:val="475569"/>
                 <w:sz w:val="16"/>
               </w:rPr>
               <w:t>SIGNATURE</w:t>
@@ -6909,7 +6909,7 @@
                 <w:rFonts w:ascii="Calibri" w:hAnsi="Calibri"/>
                 <w:b w:val="0"/>
                 <w:i w:val="0"/>
-                <w:color w:val="334155"/>
+                <w:color w:val="2B3849"/>
                 <w:sz w:val="19"/>
               </w:rPr>
               <w:t>Send the completed declaration to info@vyntrapropertyservices.com with your documents to activate your account.</w:t>
@@ -6929,7 +6929,7 @@
           <w:rFonts w:ascii="Calibri" w:hAnsi="Calibri"/>
           <w:b w:val="0"/>
           <w:i w:val="0"/>
-          <w:color w:val="64748B"/>
+          <w:color w:val="475569"/>
           <w:sz w:val="16"/>
         </w:rPr>
         <w:t>Vyntra Property Services · ABN 69 252 402 831 · Level 12, 1 Sydney Avenue, Sydney NSW · This declaration forms part of your engagement with Vyntra.</w:t>
@@ -7029,7 +7029,7 @@
           <w:rFonts w:ascii="Calibri" w:hAnsi="Calibri"/>
           <w:b w:val="0"/>
           <w:i w:val="0"/>
-          <w:color w:val="64748B"/>
+          <w:color w:val="475569"/>
           <w:sz w:val="19"/>
         </w:rPr>
         <w:t>Return your signed declaration and required documents to Vyntra.</w:t>
@@ -7064,7 +7064,7 @@
           <w:rFonts w:ascii="Calibri" w:hAnsi="Calibri"/>
           <w:b w:val="0"/>
           <w:i w:val="0"/>
-          <w:color w:val="64748B"/>
+          <w:color w:val="475569"/>
           <w:sz w:val="19"/>
         </w:rPr>
         <w:t>We check your documents, insurance and any required clearances — usually within 2–3 business days.</w:t>
@@ -7099,7 +7099,7 @@
           <w:rFonts w:ascii="Calibri" w:hAnsi="Calibri"/>
           <w:b w:val="0"/>
           <w:i w:val="0"/>
-          <w:color w:val="64748B"/>
+          <w:color w:val="475569"/>
           <w:sz w:val="19"/>
         </w:rPr>
         <w:t>Once everything checks out, we confirm that you are approved to work with Vyntra.</w:t>
@@ -7134,7 +7134,7 @@
           <w:rFonts w:ascii="Calibri" w:hAnsi="Calibri"/>
           <w:b w:val="0"/>
           <w:i w:val="0"/>
-          <w:color w:val="64748B"/>
+          <w:color w:val="475569"/>
           <w:sz w:val="19"/>
         </w:rPr>
         <w:t>We set up your subcontractor profile and add you to our active network.</w:t>
@@ -7169,7 +7169,7 @@
           <w:rFonts w:ascii="Calibri" w:hAnsi="Calibri"/>
           <w:b w:val="0"/>
           <w:i w:val="0"/>
-          <w:color w:val="64748B"/>
+          <w:color w:val="475569"/>
           <w:sz w:val="19"/>
         </w:rPr>
         <w:t>You start receiving job offers that match your trade, availability and service area.</w:t>
@@ -7226,7 +7226,7 @@
                 <w:rFonts w:ascii="Calibri" w:hAnsi="Calibri"/>
                 <w:b w:val="0"/>
                 <w:i w:val="0"/>
-                <w:color w:val="334155"/>
+                <w:color w:val="2B3849"/>
                 <w:sz w:val="19"/>
               </w:rPr>
               <w:t>If anything needs updating, we will let you know exactly what is required — so nothing holds up your start.</w:t>
@@ -7481,7 +7481,7 @@
     <w:r>
       <w:drawing>
         <wp:inline xmlns:a="http://schemas.openxmlformats.org/drawingml/2006/main" xmlns:pic="http://schemas.openxmlformats.org/drawingml/2006/picture">
-          <wp:extent cx="1035556" cy="216000"/>
+          <wp:extent cx="1006225" cy="216000"/>
           <wp:docPr id="1" name="Picture 1"/>
           <wp:cNvGraphicFramePr>
             <a:graphicFrameLocks noChangeAspect="1"/>
@@ -7502,7 +7502,7 @@
                 <pic:spPr>
                   <a:xfrm>
                     <a:off x="0" y="0"/>
-                    <a:ext cx="1035556" cy="216000"/>
+                    <a:ext cx="1006225" cy="216000"/>
                   </a:xfrm>
                   <a:prstGeom prst="rect"/>
                 </pic:spPr>
@@ -7515,7 +7515,7 @@
     <w:r>
       <w:rPr>
         <w:rFonts w:ascii="Calibri" w:hAnsi="Calibri"/>
-        <w:color w:val="64748B"/>
+        <w:color w:val="475569"/>
         <w:sz w:val="16"/>
       </w:rPr>
       <w:t xml:space="preserve">   Subcontractor Onboarding Pack</w:t>
@@ -7889,7 +7889,7 @@
     <w:rsid w:val="00FC693F"/>
     <w:rPr>
       <w:rFonts w:ascii="Calibri" w:hAnsi="Calibri"/>
-      <w:color w:val="334155"/>
+      <w:color w:val="2B3849"/>
       <w:sz w:val="21"/>
     </w:rPr>
   </w:style>

</xml_diff>

<commit_message>
Header logo on navy plate (no text recolour); higher-quality logo
- Use the high-resolution (1536x1024) transparent logo source.
- Page headers now place the logo on a navy "plate" so the original white
  VYNTRA wordmark reads correctly — no pixel recolouring (removes the quality
  loss). Drop the recoloured light variant.
- Cover and DOCX use the same high-res lockup; DOCX running header uses the
  navy-flattened logo.

Co-Authored-By: Claude Opus 4.8 <noreply@anthropic.com>
Claude-Session: https://claude.ai/code/session_014U2YUKzxVsPNM9UfUwPNwA
</commit_message>
<xml_diff>
--- a/onboarding-pack/dist/Vyntra-Subcontractor-Onboarding-Pack.docx
+++ b/onboarding-pack/dist/Vyntra-Subcontractor-Onboarding-Pack.docx
@@ -41,7 +41,7 @@
             <w:r>
               <w:drawing>
                 <wp:inline xmlns:a="http://schemas.openxmlformats.org/drawingml/2006/main" xmlns:pic="http://schemas.openxmlformats.org/drawingml/2006/picture">
-                  <wp:extent cx="3240000" cy="695510"/>
+                  <wp:extent cx="3240000" cy="703180"/>
                   <wp:docPr id="1" name="Picture 1"/>
                   <wp:cNvGraphicFramePr>
                     <a:graphicFrameLocks noChangeAspect="1"/>
@@ -62,7 +62,7 @@
                         <pic:spPr>
                           <a:xfrm>
                             <a:off x="0" y="0"/>
-                            <a:ext cx="3240000" cy="695510"/>
+                            <a:ext cx="3240000" cy="703180"/>
                           </a:xfrm>
                           <a:prstGeom prst="rect"/>
                         </pic:spPr>
@@ -7481,7 +7481,7 @@
     <w:r>
       <w:drawing>
         <wp:inline xmlns:a="http://schemas.openxmlformats.org/drawingml/2006/main" xmlns:pic="http://schemas.openxmlformats.org/drawingml/2006/picture">
-          <wp:extent cx="1006225" cy="216000"/>
+          <wp:extent cx="995250" cy="216000"/>
           <wp:docPr id="1" name="Picture 1"/>
           <wp:cNvGraphicFramePr>
             <a:graphicFrameLocks noChangeAspect="1"/>
@@ -7490,7 +7490,7 @@
             <a:graphicData uri="http://schemas.openxmlformats.org/drawingml/2006/picture">
               <pic:pic>
                 <pic:nvPicPr>
-                  <pic:cNvPr id="0" name="logo-light.png"/>
+                  <pic:cNvPr id="0" name="logo-on-navy.png"/>
                   <pic:cNvPicPr/>
                 </pic:nvPicPr>
                 <pic:blipFill>
@@ -7502,7 +7502,7 @@
                 <pic:spPr>
                   <a:xfrm>
                     <a:off x="0" y="0"/>
-                    <a:ext cx="1006225" cy="216000"/>
+                    <a:ext cx="995250" cy="216000"/>
                   </a:xfrm>
                   <a:prstGeom prst="rect"/>
                 </pic:spPr>

</xml_diff>

<commit_message>
Enlarge header logo; fix timeline line overlapping callout
- Increase the page-header logo size on pages 2-16 (DOCX running header too),
  with slightly tightened masthead spacing so content room is preserved.
- Fix page 3 "How Vyntra works": the "Keep it moving" callout sat inside the
  timeline container, so the vertical connector line ran down behind it. Move
  the callout outside .flow. Audited every timeline/positioned element — no
  other content overlaps.

Co-Authored-By: Claude Opus 4.8 <noreply@anthropic.com>
Claude-Session: https://claude.ai/code/session_014U2YUKzxVsPNM9UfUwPNwA
</commit_message>
<xml_diff>
--- a/onboarding-pack/dist/Vyntra-Subcontractor-Onboarding-Pack.docx
+++ b/onboarding-pack/dist/Vyntra-Subcontractor-Onboarding-Pack.docx
@@ -7481,7 +7481,7 @@
     <w:r>
       <w:drawing>
         <wp:inline xmlns:a="http://schemas.openxmlformats.org/drawingml/2006/main" xmlns:pic="http://schemas.openxmlformats.org/drawingml/2006/picture">
-          <wp:extent cx="995250" cy="216000"/>
+          <wp:extent cx="1409938" cy="306000"/>
           <wp:docPr id="1" name="Picture 1"/>
           <wp:cNvGraphicFramePr>
             <a:graphicFrameLocks noChangeAspect="1"/>
@@ -7502,7 +7502,7 @@
                 <pic:spPr>
                   <a:xfrm>
                     <a:off x="0" y="0"/>
-                    <a:ext cx="995250" cy="216000"/>
+                    <a:ext cx="1409938" cy="306000"/>
                   </a:xfrm>
                   <a:prstGeom prst="rect"/>
                 </pic:spPr>

</xml_diff>